<commit_message>
Fix §3.4: clarify dual metrics (cosine embedding + SequenceMatcher surface)
</commit_message>
<xml_diff>
--- a/paper_final_v3_figures.docx
+++ b/paper_final_v3_figures.docx
@@ -295,7 +295,12 @@
         <w:pStyle w:val="ListBullet"/>
       </w:pPr>
       <w:r>
-        <w:t>Embedding Similarity: Pairwise cosine similarity between agent responses using all-MiniLM-L6-v2 (Reimers &amp; Gurevych, 2019). Captures semantic convergence below the threshold of exact identity.</w:t>
+        <w:t>Embedding Similarity: Pairwise cosine similarity between agent responses using all-MiniLM-L6-v2 (Reimers &amp; Gurevych, 2019). Used for computing divergence trajectories (Spearman ρ between round index and mean pairwise embedding distance).</w:t>
+      </w:r>
+    </w:p>
+    <w:p>
+      <w:r>
+        <w:t>Surface Similarity: SequenceMatcher ratio (Python difflib), measuring character-level text overlap between agent responses. Used for identity collapse detection and convergence trajectory figures. Values of 1.0 indicate token-for-token identical outputs.</w:t>
       </w:r>
     </w:p>
     <w:p>

</xml_diff>